<commit_message>
Update HLD Word document (.docx) with High-Level Reference Architecture Diagram
</commit_message>
<xml_diff>
--- a/Agent_Policy_and_Compliance_Tower_HLD.docx
+++ b/Agent_Policy_and_Compliance_Tower_HLD.docx
@@ -90,7 +90,7 @@
                 <w:color w:val="3C4043"/>
                 <w:sz w:val="19"/>
               </w:rPr>
-              <w:t>1.0 (Production High-Level Design)</w:t>
+              <w:t>1.1 (Production HLD with Reference Architecture Diagram)</w:t>
             </w:r>
           </w:p>
         </w:tc>
@@ -296,7 +296,62 @@
         <w:spacing w:after="160"/>
       </w:pPr>
       <w:r>
-        <w:t>The production platform is deployed on Google Cloud Platform, positioning a high-throughput **Policy Ingress Gateway** on Cloud Run between client applications and Google's Gemini Agent Runtime.</w:t>
+        <w:t>The production platform is deployed on Google Cloud Platform, positioning a high-throughput **Policy Ingress Gateway** on Cloud Run between client applications and Google's Gemini Agent Runtime. Below is the high-level architecture diagram illustrating the end-to-end data flow across all 5 security and governance layers:</w:t>
+      </w:r>
+    </w:p>
+    <w:p>
+      <w:pPr>
+        <w:spacing w:before="120" w:after="80"/>
+        <w:jc w:val="center"/>
+      </w:pPr>
+      <w:r>
+        <w:drawing>
+          <wp:inline xmlns:a="http://schemas.openxmlformats.org/drawingml/2006/main" xmlns:pic="http://schemas.openxmlformats.org/drawingml/2006/picture">
+            <wp:extent cx="5669280" cy="5669280"/>
+            <wp:docPr id="1" name="Picture 1"/>
+            <wp:cNvGraphicFramePr>
+              <a:graphicFrameLocks noChangeAspect="1"/>
+            </wp:cNvGraphicFramePr>
+            <a:graphic>
+              <a:graphicData uri="http://schemas.openxmlformats.org/drawingml/2006/picture">
+                <pic:pic>
+                  <pic:nvPicPr>
+                    <pic:cNvPr id="0" name="hld_architecture_diagram_1784560022555.png"/>
+                    <pic:cNvPicPr/>
+                  </pic:nvPicPr>
+                  <pic:blipFill>
+                    <a:blip r:embed="rId9"/>
+                    <a:stretch>
+                      <a:fillRect/>
+                    </a:stretch>
+                  </pic:blipFill>
+                  <pic:spPr>
+                    <a:xfrm>
+                      <a:off x="0" y="0"/>
+                      <a:ext cx="5669280" cy="5669280"/>
+                    </a:xfrm>
+                    <a:prstGeom prst="rect"/>
+                  </pic:spPr>
+                </pic:pic>
+              </a:graphicData>
+            </a:graphic>
+          </wp:inline>
+        </w:drawing>
+      </w:r>
+    </w:p>
+    <w:p>
+      <w:pPr>
+        <w:spacing w:after="240"/>
+        <w:jc w:val="center"/>
+      </w:pPr>
+      <w:r>
+        <w:rPr>
+          <w:b/>
+          <w:i/>
+          <w:color w:val="5F6368"/>
+          <w:sz w:val="18"/>
+        </w:rPr>
+        <w:t>Figure 1: High-Level Reference Architecture Diagram — Agent Policy and Compliance Tower on Google Cloud Platform</w:t>
       </w:r>
     </w:p>
     <w:p>
@@ -959,7 +1014,7 @@
         <w:drawing>
           <wp:inline xmlns:a="http://schemas.openxmlformats.org/drawingml/2006/main" xmlns:pic="http://schemas.openxmlformats.org/drawingml/2006/picture">
             <wp:extent cx="5486400" cy="3429000"/>
-            <wp:docPr id="1" name="Picture 1"/>
+            <wp:docPr id="2" name="Picture 2"/>
             <wp:cNvGraphicFramePr>
               <a:graphicFrameLocks noChangeAspect="1"/>
             </wp:cNvGraphicFramePr>
@@ -968,81 +1023,6 @@
                 <pic:pic>
                   <pic:nvPicPr>
                     <pic:cNvPr id="0" name="app_rules.png"/>
-                    <pic:cNvPicPr/>
-                  </pic:nvPicPr>
-                  <pic:blipFill>
-                    <a:blip r:embed="rId9"/>
-                    <a:stretch>
-                      <a:fillRect/>
-                    </a:stretch>
-                  </pic:blipFill>
-                  <pic:spPr>
-                    <a:xfrm>
-                      <a:off x="0" y="0"/>
-                      <a:ext cx="5486400" cy="3429000"/>
-                    </a:xfrm>
-                    <a:prstGeom prst="rect"/>
-                  </pic:spPr>
-                </pic:pic>
-              </a:graphicData>
-            </a:graphic>
-          </wp:inline>
-        </w:drawing>
-      </w:r>
-    </w:p>
-    <w:p>
-      <w:pPr>
-        <w:spacing w:after="200"/>
-        <w:jc w:val="center"/>
-      </w:pPr>
-      <w:r>
-        <w:rPr>
-          <w:i/>
-          <w:color w:val="5F6368"/>
-          <w:sz w:val="18"/>
-        </w:rPr>
-        <w:t>Figure 1: Live Screenshot from http://localhost:8081/?tab=rules — Active Policy Rules (GDPR-ERASURE, DPDP-AADHAAR, SOC2-INTEGRITY, HIPAA-PII)</w:t>
-      </w:r>
-    </w:p>
-    <w:p>
-      <w:pPr>
-        <w:spacing w:before="240" w:after="80"/>
-      </w:pPr>
-      <w:r>
-        <w:rPr>
-          <w:b/>
-          <w:color w:val="1A73E8"/>
-          <w:sz w:val="25"/>
-        </w:rPr>
-        <w:t>Module 2: Multi-Framework Regulatory Compliance Auditor</w:t>
-      </w:r>
-    </w:p>
-    <w:p>
-      <w:pPr>
-        <w:spacing w:after="120"/>
-      </w:pPr>
-      <w:r>
-        <w:t>Provides real-time compliance checklists and automated rule mapping across HIPAA, SOC 2 Type II, EU GDPR Art. 17, India DPDP Act 2023, and Gemini Trust Platform.</w:t>
-      </w:r>
-    </w:p>
-    <w:p>
-      <w:pPr>
-        <w:spacing w:before="80" w:after="80"/>
-        <w:jc w:val="center"/>
-      </w:pPr>
-      <w:r>
-        <w:drawing>
-          <wp:inline xmlns:a="http://schemas.openxmlformats.org/drawingml/2006/main" xmlns:pic="http://schemas.openxmlformats.org/drawingml/2006/picture">
-            <wp:extent cx="5486400" cy="3429000"/>
-            <wp:docPr id="2" name="Picture 2"/>
-            <wp:cNvGraphicFramePr>
-              <a:graphicFrameLocks noChangeAspect="1"/>
-            </wp:cNvGraphicFramePr>
-            <a:graphic>
-              <a:graphicData uri="http://schemas.openxmlformats.org/drawingml/2006/picture">
-                <pic:pic>
-                  <pic:nvPicPr>
-                    <pic:cNvPr id="0" name="app_compliance.png"/>
                     <pic:cNvPicPr/>
                   </pic:nvPicPr>
                   <pic:blipFill>
@@ -1076,7 +1056,7 @@
           <w:color w:val="5F6368"/>
           <w:sz w:val="18"/>
         </w:rPr>
-        <w:t>Figure 2: Live Screenshot from http://localhost:8081/?tab=compliance — Multi-Framework Compliance Auditor Console</w:t>
+        <w:t>Figure 2: Live Screenshot from http://localhost:8081/?tab=rules — Active Policy Rules (GDPR-ERASURE, DPDP-AADHAAR, SOC2-INTEGRITY, HIPAA-PII)</w:t>
       </w:r>
     </w:p>
     <w:p>
@@ -1089,7 +1069,7 @@
           <w:color w:val="1A73E8"/>
           <w:sz w:val="25"/>
         </w:rPr>
-        <w:t>Module 3: Gemini Trust Safety &amp; Agent Search Grounding Engine</w:t>
+        <w:t>Module 2: Multi-Framework Regulatory Compliance Auditor</w:t>
       </w:r>
     </w:p>
     <w:p>
@@ -1097,7 +1077,7 @@
         <w:spacing w:after="120"/>
       </w:pPr>
       <w:r>
-        <w:t>Binds UI threshold controls to Gemini Safety Guardrails and fact-checks model completions against enterprise data stores, achieving 98% citation precision.</w:t>
+        <w:t>Provides real-time compliance checklists and automated rule mapping across HIPAA, SOC 2 Type II, EU GDPR Art. 17, India DPDP Act 2023, and Gemini Trust Platform.</w:t>
       </w:r>
     </w:p>
     <w:p>
@@ -1117,7 +1097,7 @@
               <a:graphicData uri="http://schemas.openxmlformats.org/drawingml/2006/picture">
                 <pic:pic>
                   <pic:nvPicPr>
-                    <pic:cNvPr id="0" name="app_grounding.png"/>
+                    <pic:cNvPr id="0" name="module2_compliance_auditor.png"/>
                     <pic:cNvPicPr/>
                   </pic:nvPicPr>
                   <pic:blipFill>
@@ -1151,7 +1131,7 @@
           <w:color w:val="5F6368"/>
           <w:sz w:val="18"/>
         </w:rPr>
-        <w:t>Figure 3: Live Screenshot from http://localhost:8081/?tab=grounding — Agent Search Grounding Citation Verification &amp; Explainability Console</w:t>
+        <w:t>Figure 3: Live Screenshot from http://localhost:8081/?tab=compliance — Multi-Framework Compliance Auditor Console</w:t>
       </w:r>
     </w:p>
     <w:p>
@@ -1164,7 +1144,7 @@
           <w:color w:val="1A73E8"/>
           <w:sz w:val="25"/>
         </w:rPr>
-        <w:t>Module 4: Cryptographic Audit Ledger &amp; Compliance Package Exporter</w:t>
+        <w:t>Module 3: Gemini Trust Safety &amp; Agent Search Grounding Engine</w:t>
       </w:r>
     </w:p>
     <w:p>
@@ -1172,7 +1152,7 @@
         <w:spacing w:after="120"/>
       </w:pPr>
       <w:r>
-        <w:t>Maintains a SHA-256 block chain (current.prevHash === prev.hash) signed via Cloud KMS asymmetric keys, enabling automated chain verification and PDF/CSV compliance package downloads.</w:t>
+        <w:t>Binds UI threshold controls to Gemini Safety Guardrails and fact-checks model completions against enterprise data stores, achieving 98% citation precision.</w:t>
       </w:r>
     </w:p>
     <w:p>
@@ -1192,7 +1172,7 @@
               <a:graphicData uri="http://schemas.openxmlformats.org/drawingml/2006/picture">
                 <pic:pic>
                   <pic:nvPicPr>
-                    <pic:cNvPr id="0" name="app_audit.png"/>
+                    <pic:cNvPr id="0" name="app_grounding.png"/>
                     <pic:cNvPicPr/>
                   </pic:nvPicPr>
                   <pic:blipFill>
@@ -1226,7 +1206,7 @@
           <w:color w:val="5F6368"/>
           <w:sz w:val="18"/>
         </w:rPr>
-        <w:t>Figure 4: Live Screenshot from http://localhost:8081/?tab=audit — Tamper-Evident SHA-256 Audit Ledger &amp; Cloud KMS Verification</w:t>
+        <w:t>Figure 4: Live Screenshot from http://localhost:8081/?tab=grounding — Agent Search Grounding Citation Verification &amp; Explainability Console</w:t>
       </w:r>
     </w:p>
     <w:p>
@@ -1239,7 +1219,7 @@
           <w:color w:val="1A73E8"/>
           <w:sz w:val="25"/>
         </w:rPr>
-        <w:t>Module 5: Real-Time Control Tower Dashboard &amp; Risk Telemetry</w:t>
+        <w:t>Module 4: Cryptographic Audit Ledger &amp; Compliance Package Exporter</w:t>
       </w:r>
     </w:p>
     <w:p>
@@ -1247,7 +1227,7 @@
         <w:spacing w:after="120"/>
       </w:pPr>
       <w:r>
-        <w:t>Delivers a live executive command center rendering incoming prompt volumes, blocked attempts, PII redaction counters, and sub-25ms overhead latency graphs.</w:t>
+        <w:t>Maintains a SHA-256 block chain (current.prevHash === prev.hash) signed via Cloud KMS asymmetric keys, enabling automated chain verification and PDF/CSV compliance package downloads.</w:t>
       </w:r>
     </w:p>
     <w:p>
@@ -1267,7 +1247,7 @@
               <a:graphicData uri="http://schemas.openxmlformats.org/drawingml/2006/picture">
                 <pic:pic>
                   <pic:nvPicPr>
-                    <pic:cNvPr id="0" name="app_dashboard.png"/>
+                    <pic:cNvPr id="0" name="app_audit.png"/>
                     <pic:cNvPicPr/>
                   </pic:nvPicPr>
                   <pic:blipFill>
@@ -1301,7 +1281,7 @@
           <w:color w:val="5F6368"/>
           <w:sz w:val="18"/>
         </w:rPr>
-        <w:t>Figure 5: Live Screenshot from http://localhost:8081/?tab=dashboard — Control Tower Live Metrics &amp; Latency Telemetry Stream</w:t>
+        <w:t>Figure 5: Live Screenshot from http://localhost:8081/?tab=audit — Tamper-Evident SHA-256 Audit Ledger &amp; Cloud KMS Verification</w:t>
       </w:r>
     </w:p>
     <w:p>
@@ -1314,7 +1294,7 @@
           <w:color w:val="1A73E8"/>
           <w:sz w:val="25"/>
         </w:rPr>
-        <w:t>Module 6: Agentic Hub &amp; Multi-Agent Network Intercept</w:t>
+        <w:t>Module 5: Real-Time Control Tower Dashboard &amp; Risk Telemetry</w:t>
       </w:r>
     </w:p>
     <w:p>
@@ -1322,7 +1302,7 @@
         <w:spacing w:after="120"/>
       </w:pPr>
       <w:r>
-        <w:t>Manages inter-agent message interception across Orchestrator (gemini-1.5-pro), TimesFM 2.0 (GPU Cloud Run), BQML, and Chatbot (gemini-1.5-flash) operating under GCP Service Account identities.</w:t>
+        <w:t>Delivers a live executive command center rendering incoming prompt volumes, blocked attempts, PII redaction counters, and sub-25ms overhead latency graphs.</w:t>
       </w:r>
     </w:p>
     <w:p>
@@ -1342,7 +1322,7 @@
               <a:graphicData uri="http://schemas.openxmlformats.org/drawingml/2006/picture">
                 <pic:pic>
                   <pic:nvPicPr>
-                    <pic:cNvPr id="0" name="app_agentic.png"/>
+                    <pic:cNvPr id="0" name="app_dashboard.png"/>
                     <pic:cNvPicPr/>
                   </pic:nvPicPr>
                   <pic:blipFill>
@@ -1376,7 +1356,82 @@
           <w:color w:val="5F6368"/>
           <w:sz w:val="18"/>
         </w:rPr>
-        <w:t>Figure 6: Live Screenshot from http://localhost:8081/?tab=agentic — Agentic Hub Multi-Agent Network Console</w:t>
+        <w:t>Figure 6: Live Screenshot from http://localhost:8081/?tab=dashboard — Control Tower Live Metrics &amp; Latency Telemetry Stream</w:t>
+      </w:r>
+    </w:p>
+    <w:p>
+      <w:pPr>
+        <w:spacing w:before="240" w:after="80"/>
+      </w:pPr>
+      <w:r>
+        <w:rPr>
+          <w:b/>
+          <w:color w:val="1A73E8"/>
+          <w:sz w:val="25"/>
+        </w:rPr>
+        <w:t>Module 6: Agentic Hub &amp; Multi-Agent Network Intercept</w:t>
+      </w:r>
+    </w:p>
+    <w:p>
+      <w:pPr>
+        <w:spacing w:after="120"/>
+      </w:pPr>
+      <w:r>
+        <w:t>Manages inter-agent message interception across Orchestrator (gemini-1.5-pro), TimesFM 2.0 (GPU Cloud Run), BQML, and Chatbot (gemini-1.5-flash) operating under GCP Service Account identities.</w:t>
+      </w:r>
+    </w:p>
+    <w:p>
+      <w:pPr>
+        <w:spacing w:before="80" w:after="80"/>
+        <w:jc w:val="center"/>
+      </w:pPr>
+      <w:r>
+        <w:drawing>
+          <wp:inline xmlns:a="http://schemas.openxmlformats.org/drawingml/2006/main" xmlns:pic="http://schemas.openxmlformats.org/drawingml/2006/picture">
+            <wp:extent cx="5486400" cy="3429000"/>
+            <wp:docPr id="7" name="Picture 7"/>
+            <wp:cNvGraphicFramePr>
+              <a:graphicFrameLocks noChangeAspect="1"/>
+            </wp:cNvGraphicFramePr>
+            <a:graphic>
+              <a:graphicData uri="http://schemas.openxmlformats.org/drawingml/2006/picture">
+                <pic:pic>
+                  <pic:nvPicPr>
+                    <pic:cNvPr id="0" name="app_agentic.png"/>
+                    <pic:cNvPicPr/>
+                  </pic:nvPicPr>
+                  <pic:blipFill>
+                    <a:blip r:embed="rId15"/>
+                    <a:stretch>
+                      <a:fillRect/>
+                    </a:stretch>
+                  </pic:blipFill>
+                  <pic:spPr>
+                    <a:xfrm>
+                      <a:off x="0" y="0"/>
+                      <a:ext cx="5486400" cy="3429000"/>
+                    </a:xfrm>
+                    <a:prstGeom prst="rect"/>
+                  </pic:spPr>
+                </pic:pic>
+              </a:graphicData>
+            </a:graphic>
+          </wp:inline>
+        </w:drawing>
+      </w:r>
+    </w:p>
+    <w:p>
+      <w:pPr>
+        <w:spacing w:after="200"/>
+        <w:jc w:val="center"/>
+      </w:pPr>
+      <w:r>
+        <w:rPr>
+          <w:i/>
+          <w:color w:val="5F6368"/>
+          <w:sz w:val="18"/>
+        </w:rPr>
+        <w:t>Figure 7: Live Screenshot from http://localhost:8081/?tab=agentic — Agentic Hub Multi-Agent Network Console</w:t>
       </w:r>
     </w:p>
     <w:sectPr>

</xml_diff>

<commit_message>
Update HLD Word document (.docx) with Light Theme Architecture Diagram & detailed 6-layer specifications
</commit_message>
<xml_diff>
--- a/Agent_Policy_and_Compliance_Tower_HLD.docx
+++ b/Agent_Policy_and_Compliance_Tower_HLD.docx
@@ -29,7 +29,7 @@
         </w:rPr>
         <w:t>High-Level Architecture &amp; System Design Document (HLD)</w:t>
         <w:br/>
-        <w:t>Full UI Architecture &amp; Google AI Ecosystem — Gemini Enterprise Agent Platform Transition</w:t>
+        <w:t>Light Theme Architecture Diagram &amp; Google AI Ecosystem Reference Model</w:t>
       </w:r>
     </w:p>
     <w:tbl>
@@ -90,7 +90,7 @@
                 <w:color w:val="3C4043"/>
                 <w:sz w:val="19"/>
               </w:rPr>
-              <w:t>2.0 (Production HLD with UI Architecture &amp; Reference Diagram)</w:t>
+              <w:t>3.0 (Light Theme Architecture Reference &amp; Complete UI Specifications)</w:t>
             </w:r>
           </w:p>
         </w:tc>
@@ -267,7 +267,7 @@
           <w:color w:val="1A73E8"/>
           <w:sz w:val="30"/>
         </w:rPr>
-        <w:t>1. Executive Summary &amp; Architectural Vision</w:t>
+        <w:t>1. Executive Summary &amp; System Vision</w:t>
       </w:r>
     </w:p>
     <w:p>
@@ -275,7 +275,7 @@
         <w:spacing w:after="200"/>
       </w:pPr>
       <w:r>
-        <w:t>The **Agent Policy and Compliance Tower** is an enterprise-grade governance, security guardrail, and audit platform designed to oversee autonomous multi-agent systems operating within the **Google AI Ecosystem**. This High-Level Design (HLD) document defines the end-to-end architectural blueprint—encompassing both the **Control Tower User Interface (UI/UX) Console** and the backend cloud infrastructure—transitioning the live web application on **http://localhost:8081/** into a real-time, production-grade middleware and observability system built natively on the **Gemini Enterprise Agent Platform**.</w:t>
+        <w:t>The **Agent Policy and Compliance Tower** is an enterprise-grade governance, security guardrail, and audit platform designed to oversee autonomous multi-agent systems operating within the **Google AI Ecosystem**. This High-Level Design (HLD) document defines the 6-layer architecture—connecting the **Control Tower UI Layer**, **Edge Security &amp; Ingress**, **Policy Gateway Middleware**, **Gemini Enterprise Agent Platform**, **Safety &amp; Grounding Engine**, and **Cryptographic Audit &amp; Telemetry**—transitioning the live web application on **http://localhost:8081/** into a production-grade system.</w:t>
       </w:r>
     </w:p>
     <w:p>
@@ -288,7 +288,7 @@
           <w:color w:val="1A73E8"/>
           <w:sz w:val="30"/>
         </w:rPr>
-        <w:t>2. Enterprise Reference Architecture &amp; GCP Bindings</w:t>
+        <w:t>2. Enterprise Reference Architecture Diagram (Light Theme)</w:t>
       </w:r>
     </w:p>
     <w:p>
@@ -296,7 +296,7 @@
         <w:spacing w:after="160"/>
       </w:pPr>
       <w:r>
-        <w:t>The production platform is deployed on Google Cloud Platform, positioning a high-throughput **Policy Ingress Gateway** on Cloud Run between client applications and Google's Gemini Agent Runtime. Below is the updated High-Level Reference Architecture Diagram explicitly highlighting the **Control Tower UI Layer (Frontend Web Console)** connected to Edge Security, Middleware Gateways, Agent Runtimes, and Audit Pipelines:</w:t>
+        <w:t>The diagram below presents the complete 6-tier system architecture rendered in a clean **Light Theme Color Palette** (pure white background, soft Google blue #E8F0FE and green #E6F4EA containers, dark navy text #202124), accurately illustrating component interactions across all operational layers:</w:t>
       </w:r>
     </w:p>
     <w:p>
@@ -316,7 +316,7 @@
               <a:graphicData uri="http://schemas.openxmlformats.org/drawingml/2006/picture">
                 <pic:pic>
                   <pic:nvPicPr>
-                    <pic:cNvPr id="0" name="hld_architecture_diagram_v2_1784593950750.png"/>
+                    <pic:cNvPr id="0" name="hld_architecture_light_theme.png"/>
                     <pic:cNvPicPr/>
                   </pic:nvPicPr>
                   <pic:blipFill>
@@ -351,102 +351,12 @@
           <w:color w:val="5F6368"/>
           <w:sz w:val="18"/>
         </w:rPr>
-        <w:t>Figure 1: High-Level Reference Architecture Diagram — Control Tower UI Layer &amp; Google Cloud Platform Bindings</w:t>
+        <w:t>Figure 1: High-Level Reference Architecture Diagram (Light Theme) — Agent Policy and Compliance Tower on Google Cloud Platform</w:t>
       </w:r>
     </w:p>
     <w:p>
       <w:pPr>
-        <w:pStyle w:val="ListBullet"/>
-        <w:spacing w:after="60"/>
-      </w:pPr>
-      <w:r>
-        <w:rPr>
-          <w:b/>
-        </w:rPr>
-        <w:t xml:space="preserve">Control Tower UI Layer (Web Console): </w:t>
-      </w:r>
-      <w:r>
-        <w:t>Single-page responsive web console (HTML5, Vanilla CSS Design System, Plus Jakarta Sans font, JetBrains Mono terminal, Chart.js) streaming real-time telemetry events via Server-Sent Events (SSE) and WebSockets from Cloud Pub/Sub.</w:t>
-      </w:r>
-    </w:p>
-    <w:p>
-      <w:pPr>
-        <w:pStyle w:val="ListBullet"/>
-        <w:spacing w:after="60"/>
-      </w:pPr>
-      <w:r>
-        <w:rPr>
-          <w:b/>
-        </w:rPr>
-        <w:t xml:space="preserve">Policy Ingress Gateway (Cloud Run / GKE): </w:t>
-      </w:r>
-      <w:r>
-        <w:t>High-performance FastAPI/Go microservice executing sub-25ms zero-trust prompt scanning, PII redaction, and prompt injection mitigation.</w:t>
-      </w:r>
-    </w:p>
-    <w:p>
-      <w:pPr>
-        <w:pStyle w:val="ListBullet"/>
-        <w:spacing w:after="60"/>
-      </w:pPr>
-      <w:r>
-        <w:rPr>
-          <w:b/>
-        </w:rPr>
-        <w:t xml:space="preserve">Gemini Enterprise Agent Platform (Agent Engine): </w:t>
-      </w:r>
-      <w:r>
-        <w:t>Managed agent runtime hosting the Fusion AI multi-agent network (Orchestrator powered by gemini-1.5-pro-002, TimesFM 2.0 forecasting model on GPU Cloud Run, BQML ARIMA+, and Chatbot powered by gemini-1.5-flash-002).</w:t>
-      </w:r>
-    </w:p>
-    <w:p>
-      <w:pPr>
-        <w:pStyle w:val="ListBullet"/>
-        <w:spacing w:after="60"/>
-      </w:pPr>
-      <w:r>
-        <w:rPr>
-          <w:b/>
-        </w:rPr>
-        <w:t xml:space="preserve">Google Cloud DLP API: </w:t>
-      </w:r>
-      <w:r>
-        <w:t>Contextual inspection service executing InfoType detection for India Aadhaar (\b\d{4}-\d{4}-\d{4}\b), Medical Record Numbers (MRN), and US SSNs under HIPAA and DPDP Act 2023.</w:t>
-      </w:r>
-    </w:p>
-    <w:p>
-      <w:pPr>
-        <w:pStyle w:val="ListBullet"/>
-        <w:spacing w:after="60"/>
-      </w:pPr>
-      <w:r>
-        <w:rPr>
-          <w:b/>
-        </w:rPr>
-        <w:t xml:space="preserve">Agent Search &amp; Grounding Engine: </w:t>
-      </w:r>
-      <w:r>
-        <w:t>Indexes enterprise data stores and computes citation precision scores to flag ungrounded model outputs.</w:t>
-      </w:r>
-    </w:p>
-    <w:p>
-      <w:pPr>
-        <w:pStyle w:val="ListBullet"/>
-        <w:spacing w:after="60"/>
-      </w:pPr>
-      <w:r>
-        <w:rPr>
-          <w:b/>
-        </w:rPr>
-        <w:t xml:space="preserve">Cloud KMS &amp; BigQuery Audit Ledger: </w:t>
-      </w:r>
-      <w:r>
-        <w:t>Digitally signs SHA-256 block chain digests via asymmetric RSA-PSS keys (RSA_SIGN_PSS_2048_SHA256) and persists logs into append-only BigQuery tables.</w:t>
-      </w:r>
-    </w:p>
-    <w:p>
-      <w:pPr>
-        <w:spacing w:after="240"/>
+        <w:spacing w:after="200"/>
       </w:pPr>
     </w:p>
     <w:p>
@@ -459,622 +369,538 @@
           <w:color w:val="1A73E8"/>
           <w:sz w:val="30"/>
         </w:rPr>
-        <w:t>3. Control Tower User Interface (UI/UX) Architecture &amp; Component Specifications</w:t>
+        <w:t>3. 6-Layer Architecture Component Specifications</w:t>
       </w:r>
     </w:p>
     <w:p>
       <w:pPr>
-        <w:spacing w:after="200"/>
+        <w:spacing w:before="240" w:after="80"/>
       </w:pPr>
       <w:r>
-        <w:t>The **Control Tower UI** is structured into 6 primary operational modules, providing real-time visibility and policy management for AI SecOps and Compliance Officers:</w:t>
+        <w:rPr>
+          <w:b/>
+          <w:color w:val="1A73E8"/>
+          <w:sz w:val="25"/>
+        </w:rPr>
+        <w:t>Layer 1: Control Tower UI Layer (Frontend Web Application Console)</w:t>
       </w:r>
     </w:p>
-    <w:tbl>
-      <w:tblPr>
-        <w:tblW w:type="auto" w:w="0"/>
-        <w:jc w:val="center"/>
-        <w:tblLayout w:type="fixed"/>
-        <w:tblLook w:firstColumn="1" w:firstRow="1" w:lastColumn="0" w:lastRow="0" w:noHBand="0" w:noVBand="1" w:val="04A0"/>
-      </w:tblPr>
-      <w:tblGrid>
-        <w:gridCol w:w="2484"/>
-        <w:gridCol w:w="2484"/>
-        <w:gridCol w:w="2484"/>
-        <w:gridCol w:w="2484"/>
-      </w:tblGrid>
-      <w:tr>
-        <w:tc>
-          <w:tcPr>
-            <w:tcW w:type="dxa" w:w="2304"/>
-            <w:shd w:fill="1A73E8"/>
-            <w:tcMar>
-              <w:top w:w="80" w:type="dxa"/>
-              <w:bottom w:w="80" w:type="dxa"/>
-              <w:left w:w="80" w:type="dxa"/>
-              <w:right w:w="80" w:type="dxa"/>
-            </w:tcMar>
-          </w:tcPr>
-          <w:p>
-            <w:r>
-              <w:rPr>
-                <w:b/>
-                <w:color w:val="FFFFFF"/>
-                <w:sz w:val="19"/>
-              </w:rPr>
-              <w:t>UI Component Module</w:t>
-            </w:r>
-          </w:p>
-        </w:tc>
-        <w:tc>
-          <w:tcPr>
-            <w:tcW w:type="dxa" w:w="2592"/>
-            <w:shd w:fill="1A73E8"/>
-            <w:tcMar>
-              <w:top w:w="80" w:type="dxa"/>
-              <w:bottom w:w="80" w:type="dxa"/>
-              <w:left w:w="80" w:type="dxa"/>
-              <w:right w:w="80" w:type="dxa"/>
-            </w:tcMar>
-          </w:tcPr>
-          <w:p>
-            <w:r>
-              <w:rPr>
-                <w:b/>
-                <w:color w:val="FFFFFF"/>
-                <w:sz w:val="19"/>
-              </w:rPr>
-              <w:t>Key Interface Elements</w:t>
-            </w:r>
-          </w:p>
-        </w:tc>
-        <w:tc>
-          <w:tcPr>
-            <w:tcW w:type="dxa" w:w="2880"/>
-            <w:shd w:fill="1A73E8"/>
-            <w:tcMar>
-              <w:top w:w="80" w:type="dxa"/>
-              <w:bottom w:w="80" w:type="dxa"/>
-              <w:left w:w="80" w:type="dxa"/>
-              <w:right w:w="80" w:type="dxa"/>
-            </w:tcMar>
-          </w:tcPr>
-          <w:p>
-            <w:r>
-              <w:rPr>
-                <w:b/>
-                <w:color w:val="FFFFFF"/>
-                <w:sz w:val="19"/>
-              </w:rPr>
-              <w:t>Operational Purpose &amp; Governance Function</w:t>
-            </w:r>
-          </w:p>
-        </w:tc>
-        <w:tc>
-          <w:tcPr>
-            <w:tcW w:type="dxa" w:w="2016"/>
-            <w:shd w:fill="1A73E8"/>
-            <w:tcMar>
-              <w:top w:w="80" w:type="dxa"/>
-              <w:bottom w:w="80" w:type="dxa"/>
-              <w:left w:w="80" w:type="dxa"/>
-              <w:right w:w="80" w:type="dxa"/>
-            </w:tcMar>
-          </w:tcPr>
-          <w:p>
-            <w:r>
-              <w:rPr>
-                <w:b/>
-                <w:color w:val="FFFFFF"/>
-                <w:sz w:val="19"/>
-              </w:rPr>
-              <w:t>Real-Time Data Source</w:t>
-            </w:r>
-          </w:p>
-        </w:tc>
-      </w:tr>
-      <w:tr>
-        <w:tc>
-          <w:tcPr>
-            <w:tcW w:type="dxa" w:w="2304"/>
-            <w:shd w:fill="F8F9FA"/>
-            <w:tcMar>
-              <w:top w:w="60" w:type="dxa"/>
-              <w:bottom w:w="60" w:type="dxa"/>
-              <w:left w:w="60" w:type="dxa"/>
-              <w:right w:w="60" w:type="dxa"/>
-            </w:tcMar>
-          </w:tcPr>
-          <w:p>
-            <w:r>
-              <w:rPr>
-                <w:b/>
-                <w:sz w:val="17"/>
-              </w:rPr>
-              <w:t>Module 1: Policy Dashboard Console</w:t>
-            </w:r>
-          </w:p>
-        </w:tc>
-        <w:tc>
-          <w:tcPr>
-            <w:tcW w:type="dxa" w:w="2592"/>
-            <w:shd w:fill="F8F9FA"/>
-            <w:tcMar>
-              <w:top w:w="60" w:type="dxa"/>
-              <w:bottom w:w="60" w:type="dxa"/>
-              <w:left w:w="60" w:type="dxa"/>
-              <w:right w:w="60" w:type="dxa"/>
-            </w:tcMar>
-          </w:tcPr>
-          <w:p>
-            <w:r>
-              <w:rPr>
-                <w:sz w:val="17"/>
-              </w:rPr>
-              <w:t>Sub-25ms SLA latency line graph (Chart.js), KPI cards (Blocked prompts, PII redactions, Risk score), Live Telemetry Stream</w:t>
-            </w:r>
-          </w:p>
-        </w:tc>
-        <w:tc>
-          <w:tcPr>
-            <w:tcW w:type="dxa" w:w="2880"/>
-            <w:shd w:fill="F8F9FA"/>
-            <w:tcMar>
-              <w:top w:w="60" w:type="dxa"/>
-              <w:bottom w:w="60" w:type="dxa"/>
-              <w:left w:w="60" w:type="dxa"/>
-              <w:right w:w="60" w:type="dxa"/>
-            </w:tcMar>
-          </w:tcPr>
-          <w:p>
-            <w:r>
-              <w:rPr>
-                <w:sz w:val="17"/>
-              </w:rPr>
-              <w:t>Monitors overall health, system latency overhead, active security blocks, and real-time prompt traffic volume.</w:t>
-            </w:r>
-          </w:p>
-        </w:tc>
-        <w:tc>
-          <w:tcPr>
-            <w:tcW w:type="dxa" w:w="2016"/>
-            <w:shd w:fill="F8F9FA"/>
-            <w:tcMar>
-              <w:top w:w="60" w:type="dxa"/>
-              <w:bottom w:w="60" w:type="dxa"/>
-              <w:left w:w="60" w:type="dxa"/>
-              <w:right w:w="60" w:type="dxa"/>
-            </w:tcMar>
-          </w:tcPr>
-          <w:p>
-            <w:r>
-              <w:rPr>
-                <w:sz w:val="17"/>
-              </w:rPr>
-              <w:t>Cloud Pub/Sub SSE Stream &amp; OpenTelemetry</w:t>
-            </w:r>
-          </w:p>
-        </w:tc>
-      </w:tr>
-      <w:tr>
-        <w:tc>
-          <w:tcPr>
-            <w:tcW w:type="dxa" w:w="2304"/>
-            <w:shd w:fill="FFFFFF"/>
-            <w:tcMar>
-              <w:top w:w="60" w:type="dxa"/>
-              <w:bottom w:w="60" w:type="dxa"/>
-              <w:left w:w="60" w:type="dxa"/>
-              <w:right w:w="60" w:type="dxa"/>
-            </w:tcMar>
-          </w:tcPr>
-          <w:p>
-            <w:r>
-              <w:rPr>
-                <w:b/>
-                <w:sz w:val="17"/>
-              </w:rPr>
-              <w:t>Module 2: Policy Rules Engine Manager</w:t>
-            </w:r>
-          </w:p>
-        </w:tc>
-        <w:tc>
-          <w:tcPr>
-            <w:tcW w:type="dxa" w:w="2592"/>
-            <w:shd w:fill="FFFFFF"/>
-            <w:tcMar>
-              <w:top w:w="60" w:type="dxa"/>
-              <w:bottom w:w="60" w:type="dxa"/>
-              <w:left w:w="60" w:type="dxa"/>
-              <w:right w:w="60" w:type="dxa"/>
-            </w:tcMar>
-          </w:tcPr>
-          <w:p>
-            <w:r>
-              <w:rPr>
-                <w:sz w:val="17"/>
-              </w:rPr>
-              <w:t>Active Policy Catalog (HIPAA-PII-01, DPDP-AADHAAR-02, PROMPT-INJ-03, TOOL-LOCK-04, GDPR-ERASURE-05), Interactive Dry-Run Tester</w:t>
-            </w:r>
-          </w:p>
-        </w:tc>
-        <w:tc>
-          <w:tcPr>
-            <w:tcW w:type="dxa" w:w="2880"/>
-            <w:shd w:fill="FFFFFF"/>
-            <w:tcMar>
-              <w:top w:w="60" w:type="dxa"/>
-              <w:bottom w:w="60" w:type="dxa"/>
-              <w:left w:w="60" w:type="dxa"/>
-              <w:right w:w="60" w:type="dxa"/>
-            </w:tcMar>
-          </w:tcPr>
-          <w:p>
-            <w:r>
-              <w:rPr>
-                <w:sz w:val="17"/>
-              </w:rPr>
-              <w:t>Allows SecOps admins to enable/disable guardrails, test custom prompts against regex/DLP scanners, and view PII masking results.</w:t>
-            </w:r>
-          </w:p>
-        </w:tc>
-        <w:tc>
-          <w:tcPr>
-            <w:tcW w:type="dxa" w:w="2016"/>
-            <w:shd w:fill="FFFFFF"/>
-            <w:tcMar>
-              <w:top w:w="60" w:type="dxa"/>
-              <w:bottom w:w="60" w:type="dxa"/>
-              <w:left w:w="60" w:type="dxa"/>
-              <w:right w:w="60" w:type="dxa"/>
-            </w:tcMar>
-          </w:tcPr>
-          <w:p>
-            <w:r>
-              <w:rPr>
-                <w:sz w:val="17"/>
-              </w:rPr>
-              <w:t>OPA Policy Engine &amp; Cloud DLP API</w:t>
-            </w:r>
-          </w:p>
-        </w:tc>
-      </w:tr>
-      <w:tr>
-        <w:tc>
-          <w:tcPr>
-            <w:tcW w:type="dxa" w:w="2304"/>
-            <w:shd w:fill="F8F9FA"/>
-            <w:tcMar>
-              <w:top w:w="60" w:type="dxa"/>
-              <w:bottom w:w="60" w:type="dxa"/>
-              <w:left w:w="60" w:type="dxa"/>
-              <w:right w:w="60" w:type="dxa"/>
-            </w:tcMar>
-          </w:tcPr>
-          <w:p>
-            <w:r>
-              <w:rPr>
-                <w:b/>
-                <w:sz w:val="17"/>
-              </w:rPr>
-              <w:t>Module 3: Regulatory Compliance Auditor</w:t>
-            </w:r>
-          </w:p>
-        </w:tc>
-        <w:tc>
-          <w:tcPr>
-            <w:tcW w:type="dxa" w:w="2592"/>
-            <w:shd w:fill="F8F9FA"/>
-            <w:tcMar>
-              <w:top w:w="60" w:type="dxa"/>
-              <w:bottom w:w="60" w:type="dxa"/>
-              <w:left w:w="60" w:type="dxa"/>
-              <w:right w:w="60" w:type="dxa"/>
-            </w:tcMar>
-          </w:tcPr>
-          <w:p>
-            <w:r>
-              <w:rPr>
-                <w:sz w:val="17"/>
-              </w:rPr>
-              <w:t>Dynamic Framework Selector (HIPAA, SOC 2 Type II, EU GDPR Art. 17/32, India DPDP Act 2023, Gemini Trust), Citation Checklists</w:t>
-            </w:r>
-          </w:p>
-        </w:tc>
-        <w:tc>
-          <w:tcPr>
-            <w:tcW w:type="dxa" w:w="2880"/>
-            <w:shd w:fill="F8F9FA"/>
-            <w:tcMar>
-              <w:top w:w="60" w:type="dxa"/>
-              <w:bottom w:w="60" w:type="dxa"/>
-              <w:left w:w="60" w:type="dxa"/>
-              <w:right w:w="60" w:type="dxa"/>
-            </w:tcMar>
-          </w:tcPr>
-          <w:p>
-            <w:r>
-              <w:rPr>
-                <w:sz w:val="17"/>
-              </w:rPr>
-              <w:t>Renders compliance alignment status (100% COMPLIANT), legal requirement mapping, and automated regulatory audit checklists.</w:t>
-            </w:r>
-          </w:p>
-        </w:tc>
-        <w:tc>
-          <w:tcPr>
-            <w:tcW w:type="dxa" w:w="2016"/>
-            <w:shd w:fill="F8F9FA"/>
-            <w:tcMar>
-              <w:top w:w="60" w:type="dxa"/>
-              <w:bottom w:w="60" w:type="dxa"/>
-              <w:left w:w="60" w:type="dxa"/>
-              <w:right w:w="60" w:type="dxa"/>
-            </w:tcMar>
-          </w:tcPr>
-          <w:p>
-            <w:r>
-              <w:rPr>
-                <w:sz w:val="17"/>
-              </w:rPr>
-              <w:t>BigQuery Compliance Audit Views</w:t>
-            </w:r>
-          </w:p>
-        </w:tc>
-      </w:tr>
-      <w:tr>
-        <w:tc>
-          <w:tcPr>
-            <w:tcW w:type="dxa" w:w="2304"/>
-            <w:shd w:fill="FFFFFF"/>
-            <w:tcMar>
-              <w:top w:w="60" w:type="dxa"/>
-              <w:bottom w:w="60" w:type="dxa"/>
-              <w:left w:w="60" w:type="dxa"/>
-              <w:right w:w="60" w:type="dxa"/>
-            </w:tcMar>
-          </w:tcPr>
-          <w:p>
-            <w:r>
-              <w:rPr>
-                <w:b/>
-                <w:sz w:val="17"/>
-              </w:rPr>
-              <w:t>Module 4: Safety &amp; Grounding Controls</w:t>
-            </w:r>
-          </w:p>
-        </w:tc>
-        <w:tc>
-          <w:tcPr>
-            <w:tcW w:type="dxa" w:w="2592"/>
-            <w:shd w:fill="FFFFFF"/>
-            <w:tcMar>
-              <w:top w:w="60" w:type="dxa"/>
-              <w:bottom w:w="60" w:type="dxa"/>
-              <w:left w:w="60" w:type="dxa"/>
-              <w:right w:w="60" w:type="dxa"/>
-            </w:tcMar>
-          </w:tcPr>
-          <w:p>
-            <w:r>
-              <w:rPr>
-                <w:sz w:val="17"/>
-              </w:rPr>
-              <w:t>Harm Category Safety Sliders (Harassment, Hate Speech, Dangerous Content), Radial 98.2% Grounding Precision Gauge</w:t>
-            </w:r>
-          </w:p>
-        </w:tc>
-        <w:tc>
-          <w:tcPr>
-            <w:tcW w:type="dxa" w:w="2880"/>
-            <w:shd w:fill="FFFFFF"/>
-            <w:tcMar>
-              <w:top w:w="60" w:type="dxa"/>
-              <w:bottom w:w="60" w:type="dxa"/>
-              <w:left w:w="60" w:type="dxa"/>
-              <w:right w:w="60" w:type="dxa"/>
-            </w:tcMar>
-          </w:tcPr>
-          <w:p>
-            <w:r>
-              <w:rPr>
-                <w:sz w:val="17"/>
-              </w:rPr>
-              <w:t>Enforces Vertex AI Safety Thresholds (BLOCK_MEDIUM_AND_ABOVE) and fact-checks model outputs against enterprise knowledge stores.</w:t>
-            </w:r>
-          </w:p>
-        </w:tc>
-        <w:tc>
-          <w:tcPr>
-            <w:tcW w:type="dxa" w:w="2016"/>
-            <w:shd w:fill="FFFFFF"/>
-            <w:tcMar>
-              <w:top w:w="60" w:type="dxa"/>
-              <w:bottom w:w="60" w:type="dxa"/>
-              <w:left w:w="60" w:type="dxa"/>
-              <w:right w:w="60" w:type="dxa"/>
-            </w:tcMar>
-          </w:tcPr>
-          <w:p>
-            <w:r>
-              <w:rPr>
-                <w:sz w:val="17"/>
-              </w:rPr>
-              <w:t>Agent Search Grounding Engine</w:t>
-            </w:r>
-          </w:p>
-        </w:tc>
-      </w:tr>
-      <w:tr>
-        <w:tc>
-          <w:tcPr>
-            <w:tcW w:type="dxa" w:w="2304"/>
-            <w:shd w:fill="F8F9FA"/>
-            <w:tcMar>
-              <w:top w:w="60" w:type="dxa"/>
-              <w:bottom w:w="60" w:type="dxa"/>
-              <w:left w:w="60" w:type="dxa"/>
-              <w:right w:w="60" w:type="dxa"/>
-            </w:tcMar>
-          </w:tcPr>
-          <w:p>
-            <w:r>
-              <w:rPr>
-                <w:b/>
-                <w:sz w:val="17"/>
-              </w:rPr>
-              <w:t>Module 5: Tamper-Evident Audit Terminal</w:t>
-            </w:r>
-          </w:p>
-        </w:tc>
-        <w:tc>
-          <w:tcPr>
-            <w:tcW w:type="dxa" w:w="2592"/>
-            <w:shd w:fill="F8F9FA"/>
-            <w:tcMar>
-              <w:top w:w="60" w:type="dxa"/>
-              <w:bottom w:w="60" w:type="dxa"/>
-              <w:left w:w="60" w:type="dxa"/>
-              <w:right w:w="60" w:type="dxa"/>
-            </w:tcMar>
-          </w:tcPr>
-          <w:p>
-            <w:r>
-              <w:rPr>
-                <w:sz w:val="17"/>
-              </w:rPr>
-              <w:t>Terminal Log Window (JetBrains Mono font), Chain Integrity Verification Trigger, PDF/CSV Audit Package Exporter</w:t>
-            </w:r>
-          </w:p>
-        </w:tc>
-        <w:tc>
-          <w:tcPr>
-            <w:tcW w:type="dxa" w:w="2880"/>
-            <w:shd w:fill="F8F9FA"/>
-            <w:tcMar>
-              <w:top w:w="60" w:type="dxa"/>
-              <w:bottom w:w="60" w:type="dxa"/>
-              <w:left w:w="60" w:type="dxa"/>
-              <w:right w:w="60" w:type="dxa"/>
-            </w:tcMar>
-          </w:tcPr>
-          <w:p>
-            <w:r>
-              <w:rPr>
-                <w:sz w:val="17"/>
-              </w:rPr>
-              <w:t>Displays SHA-256 block chain linkage (current.prevHash === prev.hash) signed via Cloud KMS RSA-PSS keys, offering 1-click audit downloads.</w:t>
-            </w:r>
-          </w:p>
-        </w:tc>
-        <w:tc>
-          <w:tcPr>
-            <w:tcW w:type="dxa" w:w="2016"/>
-            <w:shd w:fill="F8F9FA"/>
-            <w:tcMar>
-              <w:top w:w="60" w:type="dxa"/>
-              <w:bottom w:w="60" w:type="dxa"/>
-              <w:left w:w="60" w:type="dxa"/>
-              <w:right w:w="60" w:type="dxa"/>
-            </w:tcMar>
-          </w:tcPr>
-          <w:p>
-            <w:r>
-              <w:rPr>
-                <w:sz w:val="17"/>
-              </w:rPr>
-              <w:t>Cloud KMS &amp; BigQuery Audit Ledger</w:t>
-            </w:r>
-          </w:p>
-        </w:tc>
-      </w:tr>
-      <w:tr>
-        <w:tc>
-          <w:tcPr>
-            <w:tcW w:type="dxa" w:w="2304"/>
-            <w:shd w:fill="FFFFFF"/>
-            <w:tcMar>
-              <w:top w:w="60" w:type="dxa"/>
-              <w:bottom w:w="60" w:type="dxa"/>
-              <w:left w:w="60" w:type="dxa"/>
-              <w:right w:w="60" w:type="dxa"/>
-            </w:tcMar>
-          </w:tcPr>
-          <w:p>
-            <w:r>
-              <w:rPr>
-                <w:b/>
-                <w:sz w:val="17"/>
-              </w:rPr>
-              <w:t>Module 6: Agentic Hub &amp; What-If Simulator</w:t>
-            </w:r>
-          </w:p>
-        </w:tc>
-        <w:tc>
-          <w:tcPr>
-            <w:tcW w:type="dxa" w:w="2592"/>
-            <w:shd w:fill="FFFFFF"/>
-            <w:tcMar>
-              <w:top w:w="60" w:type="dxa"/>
-              <w:bottom w:w="60" w:type="dxa"/>
-              <w:left w:w="60" w:type="dxa"/>
-              <w:right w:w="60" w:type="dxa"/>
-            </w:tcMar>
-          </w:tcPr>
-          <w:p>
-            <w:r>
-              <w:rPr>
-                <w:sz w:val="17"/>
-              </w:rPr>
-              <w:t>Agent Network Cards (Orchestrator, TimesFM 2.0, BQML, Chatbot), Inter-Agent Log Console, Demand Shock Simulator (+10% to +50%)</w:t>
-            </w:r>
-          </w:p>
-        </w:tc>
-        <w:tc>
-          <w:tcPr>
-            <w:tcW w:type="dxa" w:w="2880"/>
-            <w:shd w:fill="FFFFFF"/>
-            <w:tcMar>
-              <w:top w:w="60" w:type="dxa"/>
-              <w:bottom w:w="60" w:type="dxa"/>
-              <w:left w:w="60" w:type="dxa"/>
-              <w:right w:w="60" w:type="dxa"/>
-            </w:tcMar>
-          </w:tcPr>
-          <w:p>
-            <w:r>
-              <w:rPr>
-                <w:sz w:val="17"/>
-              </w:rPr>
-              <w:t>Monitors inter-agent communication under GCP Service Account IAM, simulating extreme demand shocks on agent forecasting workflows.</w:t>
-            </w:r>
-          </w:p>
-        </w:tc>
-        <w:tc>
-          <w:tcPr>
-            <w:tcW w:type="dxa" w:w="2016"/>
-            <w:shd w:fill="FFFFFF"/>
-            <w:tcMar>
-              <w:top w:w="60" w:type="dxa"/>
-              <w:bottom w:w="60" w:type="dxa"/>
-              <w:left w:w="60" w:type="dxa"/>
-              <w:right w:w="60" w:type="dxa"/>
-            </w:tcMar>
-          </w:tcPr>
-          <w:p>
-            <w:r>
-              <w:rPr>
-                <w:sz w:val="17"/>
-              </w:rPr>
-              <w:t>Vertex AI Agent Engine &amp; Pub/Sub</w:t>
-            </w:r>
-          </w:p>
-        </w:tc>
-      </w:tr>
-    </w:tbl>
     <w:p>
       <w:pPr>
-        <w:spacing w:after="280"/>
+        <w:spacing w:after="120"/>
+      </w:pPr>
+      <w:r>
+        <w:t>Single-page responsive web console (HTML5, Vanilla CSS Design System, Plus Jakarta Sans &amp; JetBrains Mono typography, Chart.js) streaming real-time events via Server-Sent Events (SSE) from Cloud Pub/Sub.</w:t>
+      </w:r>
+    </w:p>
+    <w:p>
+      <w:pPr>
+        <w:pStyle w:val="ListBullet"/>
+        <w:spacing w:after="40"/>
+      </w:pPr>
+      <w:r>
+        <w:rPr>
+          <w:b/>
+        </w:rPr>
+        <w:t xml:space="preserve">Policy Dashboard: </w:t>
+      </w:r>
+      <w:r>
+        <w:t>Displays sample metrics, active policy rules, and real-time security notifications.</w:t>
+      </w:r>
+    </w:p>
+    <w:p>
+      <w:pPr>
+        <w:pStyle w:val="ListBullet"/>
+        <w:spacing w:after="40"/>
+      </w:pPr>
+      <w:r>
+        <w:rPr>
+          <w:b/>
+        </w:rPr>
+        <w:t xml:space="preserve">Policy Rules Engine: </w:t>
+      </w:r>
+      <w:r>
+        <w:t>Renders active policy rules and provides interactive policy rules enforcement testing.</w:t>
+      </w:r>
+    </w:p>
+    <w:p>
+      <w:pPr>
+        <w:pStyle w:val="ListBullet"/>
+        <w:spacing w:after="40"/>
+      </w:pPr>
+      <w:r>
+        <w:rPr>
+          <w:b/>
+        </w:rPr>
+        <w:t xml:space="preserve">Compliance Auditor: </w:t>
+      </w:r>
+      <w:r>
+        <w:t>Secures policy enforcement status and presents notes for legal compliance auditors.</w:t>
+      </w:r>
+    </w:p>
+    <w:p>
+      <w:pPr>
+        <w:pStyle w:val="ListBullet"/>
+        <w:spacing w:after="40"/>
+      </w:pPr>
+      <w:r>
+        <w:rPr>
+          <w:b/>
+        </w:rPr>
+        <w:t xml:space="preserve">Safety &amp; Grounding Controls: </w:t>
+      </w:r>
+      <w:r>
+        <w:t>Manages safety thresholds and grounding citation controls.</w:t>
+      </w:r>
+    </w:p>
+    <w:p>
+      <w:pPr>
+        <w:pStyle w:val="ListBullet"/>
+        <w:spacing w:after="40"/>
+      </w:pPr>
+      <w:r>
+        <w:rPr>
+          <w:b/>
+        </w:rPr>
+        <w:t xml:space="preserve">Cryptographic Audit Terminal: </w:t>
+      </w:r>
+      <w:r>
+        <w:t>Displays key details, block chain hashing, and detailed audit information.</w:t>
+      </w:r>
+    </w:p>
+    <w:p>
+      <w:pPr>
+        <w:pStyle w:val="ListBullet"/>
+        <w:spacing w:after="40"/>
+      </w:pPr>
+      <w:r>
+        <w:rPr>
+          <w:b/>
+        </w:rPr>
+        <w:t xml:space="preserve">What-If Simulator: </w:t>
+      </w:r>
+      <w:r>
+        <w:t>Evaluates sample routes, what-if demand shock simulations (+10% to +50%), and log retention policies.</w:t>
+      </w:r>
+    </w:p>
+    <w:p>
+      <w:pPr>
+        <w:spacing w:after="120"/>
+      </w:pPr>
+    </w:p>
+    <w:p>
+      <w:pPr>
+        <w:spacing w:before="240" w:after="80"/>
+      </w:pPr>
+      <w:r>
+        <w:rPr>
+          <w:b/>
+          <w:color w:val="1A73E8"/>
+          <w:sz w:val="25"/>
+        </w:rPr>
+        <w:t>Layer 2: Edge Security &amp; Ingress Layer</w:t>
+      </w:r>
+    </w:p>
+    <w:p>
+      <w:pPr>
+        <w:spacing w:after="120"/>
+      </w:pPr>
+      <w:r>
+        <w:t>Protects edge entry points and manages identity federation before requests reach internal middleware gateways.</w:t>
+      </w:r>
+    </w:p>
+    <w:p>
+      <w:pPr>
+        <w:pStyle w:val="ListBullet"/>
+        <w:spacing w:after="40"/>
+      </w:pPr>
+      <w:r>
+        <w:rPr>
+          <w:b/>
+        </w:rPr>
+        <w:t xml:space="preserve">Cloud Armor: </w:t>
+      </w:r>
+      <w:r>
+        <w:t>Protects edge endpoints against DDoS attacks and Web Application Firewall (WAF) vulnerabilities.</w:t>
+      </w:r>
+    </w:p>
+    <w:p>
+      <w:pPr>
+        <w:pStyle w:val="ListBullet"/>
+        <w:spacing w:after="40"/>
+      </w:pPr>
+      <w:r>
+        <w:rPr>
+          <w:b/>
+        </w:rPr>
+        <w:t xml:space="preserve">Cloud Load Balancer: </w:t>
+      </w:r>
+      <w:r>
+        <w:t>Distributes incoming traffic across auto-scaling Cloud Run gateway instances.</w:t>
+      </w:r>
+    </w:p>
+    <w:p>
+      <w:pPr>
+        <w:pStyle w:val="ListBullet"/>
+        <w:spacing w:after="40"/>
+      </w:pPr>
+      <w:r>
+        <w:rPr>
+          <w:b/>
+        </w:rPr>
+        <w:t xml:space="preserve">Google Cloud Model Armor: </w:t>
+      </w:r>
+      <w:r>
+        <w:t>Applies specialized ML security screening at the edge ingress layer.</w:t>
+      </w:r>
+    </w:p>
+    <w:p>
+      <w:pPr>
+        <w:pStyle w:val="ListBullet"/>
+        <w:spacing w:after="40"/>
+      </w:pPr>
+      <w:r>
+        <w:rPr>
+          <w:b/>
+        </w:rPr>
+        <w:t xml:space="preserve">Cloud Identity WIF (Workforce Identity Federation): </w:t>
+      </w:r>
+      <w:r>
+        <w:t>Enforces OAuth 2.0 / OIDC authentication for SecOps admins and automated service accounts.</w:t>
+      </w:r>
+    </w:p>
+    <w:p>
+      <w:pPr>
+        <w:spacing w:after="120"/>
+      </w:pPr>
+    </w:p>
+    <w:p>
+      <w:pPr>
+        <w:spacing w:before="240" w:after="80"/>
+      </w:pPr>
+      <w:r>
+        <w:rPr>
+          <w:b/>
+          <w:color w:val="1A73E8"/>
+          <w:sz w:val="25"/>
+        </w:rPr>
+        <w:t>Layer 3: Policy Gateway Middleware Layer</w:t>
+      </w:r>
+    </w:p>
+    <w:p>
+      <w:pPr>
+        <w:spacing w:after="120"/>
+      </w:pPr>
+      <w:r>
+        <w:t>Containerized FastAPI/Go workers on Cloud Run enforcing zero-trust payload screening under a sub-25ms SLA.</w:t>
+      </w:r>
+    </w:p>
+    <w:p>
+      <w:pPr>
+        <w:pStyle w:val="ListBullet"/>
+        <w:spacing w:after="40"/>
+      </w:pPr>
+      <w:r>
+        <w:rPr>
+          <w:b/>
+        </w:rPr>
+        <w:t xml:space="preserve">FastAPI / Cloud Run: </w:t>
+      </w:r>
+      <w:r>
+        <w:t>High-performance proxy workers serving on the gateway with Always-On CPU allocation.</w:t>
+      </w:r>
+    </w:p>
+    <w:p>
+      <w:pPr>
+        <w:pStyle w:val="ListBullet"/>
+        <w:spacing w:after="40"/>
+      </w:pPr>
+      <w:r>
+        <w:rPr>
+          <w:b/>
+        </w:rPr>
+        <w:t xml:space="preserve">Cloud DLP PII Masking Microservice: </w:t>
+      </w:r>
+      <w:r>
+        <w:t>Real-time security SDK-based OTel telemetry inspecting Aadhaar (\b\d{4}-\d{4}-\d{4}\b), SSN, and MRN patterns.</w:t>
+      </w:r>
+    </w:p>
+    <w:p>
+      <w:pPr>
+        <w:pStyle w:val="ListBullet"/>
+        <w:spacing w:after="40"/>
+      </w:pPr>
+      <w:r>
+        <w:rPr>
+          <w:b/>
+        </w:rPr>
+        <w:t xml:space="preserve">Model Armor based OTel Telemetry: </w:t>
+      </w:r>
+      <w:r>
+        <w:t>Evaluates prompt embeddings against adversarial injection and jailbreak escape classifiers.</w:t>
+      </w:r>
+    </w:p>
+    <w:p>
+      <w:pPr>
+        <w:pStyle w:val="ListBullet"/>
+        <w:spacing w:after="40"/>
+      </w:pPr>
+      <w:r>
+        <w:rPr>
+          <w:b/>
+        </w:rPr>
+        <w:t xml:space="preserve">Tool Lockout Engine: </w:t>
+      </w:r>
+      <w:r>
+        <w:t>Manages access SDK-based OTel telemetry, blocking destructive tool calls (rm -rf, DB drops).</w:t>
+      </w:r>
+    </w:p>
+    <w:p>
+      <w:pPr>
+        <w:spacing w:after="120"/>
+      </w:pPr>
+    </w:p>
+    <w:p>
+      <w:pPr>
+        <w:spacing w:before="240" w:after="80"/>
+      </w:pPr>
+      <w:r>
+        <w:rPr>
+          <w:b/>
+          <w:color w:val="1A73E8"/>
+          <w:sz w:val="25"/>
+        </w:rPr>
+        <w:t>Layer 4: Gemini Enterprise Agent Platform Layer</w:t>
+      </w:r>
+    </w:p>
+    <w:p>
+      <w:pPr>
+        <w:spacing w:after="120"/>
+      </w:pPr>
+      <w:r>
+        <w:t>Managed agent orchestration runtime executing multi-step ReAct loops across specialized model endpoints.</w:t>
+      </w:r>
+    </w:p>
+    <w:p>
+      <w:pPr>
+        <w:pStyle w:val="ListBullet"/>
+        <w:spacing w:after="40"/>
+      </w:pPr>
+      <w:r>
+        <w:rPr>
+          <w:b/>
+        </w:rPr>
+        <w:t xml:space="preserve">Agent Engine Runtime: </w:t>
+      </w:r>
+      <w:r>
+        <w:t>Orchestrates different Gemini models and context assemblies.</w:t>
+      </w:r>
+    </w:p>
+    <w:p>
+      <w:pPr>
+        <w:pStyle w:val="ListBullet"/>
+        <w:spacing w:after="40"/>
+      </w:pPr>
+      <w:r>
+        <w:rPr>
+          <w:b/>
+        </w:rPr>
+        <w:t xml:space="preserve">Orchestrator Agent (Gemini 1.5 Pro): </w:t>
+      </w:r>
+      <w:r>
+        <w:t>Orchestrates complex multi-step planning and agent delegation.</w:t>
+      </w:r>
+    </w:p>
+    <w:p>
+      <w:pPr>
+        <w:pStyle w:val="ListBullet"/>
+        <w:spacing w:after="40"/>
+      </w:pPr>
+      <w:r>
+        <w:rPr>
+          <w:b/>
+        </w:rPr>
+        <w:t xml:space="preserve">Forecasting Container: </w:t>
+      </w:r>
+      <w:r>
+        <w:t>Houses TimesFM 2.0 GPU Cloud Run foundation forecasting model &amp; BQML ARIMA+ analytics model.</w:t>
+      </w:r>
+    </w:p>
+    <w:p>
+      <w:pPr>
+        <w:pStyle w:val="ListBullet"/>
+        <w:spacing w:after="40"/>
+      </w:pPr>
+      <w:r>
+        <w:rPr>
+          <w:b/>
+        </w:rPr>
+        <w:t xml:space="preserve">Chatbot Agent (Gemini 1.5 Flash): </w:t>
+      </w:r>
+      <w:r>
+        <w:t>Delivers low-latency conversational responses to internal operators and end-users.</w:t>
+      </w:r>
+    </w:p>
+    <w:p>
+      <w:pPr>
+        <w:spacing w:after="120"/>
+      </w:pPr>
+    </w:p>
+    <w:p>
+      <w:pPr>
+        <w:spacing w:before="240" w:after="80"/>
+      </w:pPr>
+      <w:r>
+        <w:rPr>
+          <w:b/>
+          <w:color w:val="1A73E8"/>
+          <w:sz w:val="25"/>
+        </w:rPr>
+        <w:t>Layer 5: Safety &amp; Grounding Engine Layer</w:t>
+      </w:r>
+    </w:p>
+    <w:p>
+      <w:pPr>
+        <w:spacing w:after="120"/>
+      </w:pPr>
+      <w:r>
+        <w:t>Fact-checks model output completions against enterprise knowledge bases and enforces harm safety category thresholds.</w:t>
+      </w:r>
+    </w:p>
+    <w:p>
+      <w:pPr>
+        <w:pStyle w:val="ListBullet"/>
+        <w:spacing w:after="40"/>
+      </w:pPr>
+      <w:r>
+        <w:rPr>
+          <w:b/>
+        </w:rPr>
+        <w:t xml:space="preserve">Agent Search Grounding: </w:t>
+      </w:r>
+      <w:r>
+        <w:t>Queries external database knowledge stores, using content safety and external validation data.</w:t>
+      </w:r>
+    </w:p>
+    <w:p>
+      <w:pPr>
+        <w:pStyle w:val="ListBullet"/>
+        <w:spacing w:after="40"/>
+      </w:pPr>
+      <w:r>
+        <w:rPr>
+          <w:b/>
+        </w:rPr>
+        <w:t xml:space="preserve">Gemini Safety Guardrails: </w:t>
+      </w:r>
+      <w:r>
+        <w:t>Filters content to block harmful material across Harassment, Hate Speech, and Dangerous Content (BLOCK_MEDIUM_AND_ABOVE).</w:t>
+      </w:r>
+    </w:p>
+    <w:p>
+      <w:pPr>
+        <w:pStyle w:val="ListBullet"/>
+        <w:spacing w:after="40"/>
+      </w:pPr>
+      <w:r>
+        <w:rPr>
+          <w:b/>
+        </w:rPr>
+        <w:t xml:space="preserve">Google Cloud Observability: </w:t>
+      </w:r>
+      <w:r>
+        <w:t>SDK-based OpenTelemetry tracking grounding precision and safety policy metrics.</w:t>
+      </w:r>
+    </w:p>
+    <w:p>
+      <w:pPr>
+        <w:spacing w:after="120"/>
+      </w:pPr>
+    </w:p>
+    <w:p>
+      <w:pPr>
+        <w:spacing w:before="240" w:after="80"/>
+      </w:pPr>
+      <w:r>
+        <w:rPr>
+          <w:b/>
+          <w:color w:val="1A73E8"/>
+          <w:sz w:val="25"/>
+        </w:rPr>
+        <w:t>Layer 6: Cryptographic Audit &amp; Telemetry Layer</w:t>
+      </w:r>
+    </w:p>
+    <w:p>
+      <w:pPr>
+        <w:spacing w:after="120"/>
+      </w:pPr>
+      <w:r>
+        <w:t>Records all actions and metrics into a tamper-evident, cryptographically signed immutable ledger.</w:t>
+      </w:r>
+    </w:p>
+    <w:p>
+      <w:pPr>
+        <w:pStyle w:val="ListBullet"/>
+        <w:spacing w:after="40"/>
+      </w:pPr>
+      <w:r>
+        <w:rPr>
+          <w:b/>
+        </w:rPr>
+        <w:t xml:space="preserve">Cloud KMS RSA-PSS Signatures: </w:t>
+      </w:r>
+      <w:r>
+        <w:t>Signs audit log digests using asymmetric RSA_SIGN_PSS_2048_SHA256 key rings.</w:t>
+      </w:r>
+    </w:p>
+    <w:p>
+      <w:pPr>
+        <w:pStyle w:val="ListBullet"/>
+        <w:spacing w:after="40"/>
+      </w:pPr>
+      <w:r>
+        <w:rPr>
+          <w:b/>
+        </w:rPr>
+        <w:t xml:space="preserve">BigQuery Immutable Ledger: </w:t>
+      </w:r>
+      <w:r>
+        <w:t>Stores append-only audit blocks with partition expiration locks and Auditor-only IAM access.</w:t>
+      </w:r>
+    </w:p>
+    <w:p>
+      <w:pPr>
+        <w:pStyle w:val="ListBullet"/>
+        <w:spacing w:after="40"/>
+      </w:pPr>
+      <w:r>
+        <w:rPr>
+          <w:b/>
+        </w:rPr>
+        <w:t xml:space="preserve">Cloud Trace &amp; Cloud Logging: </w:t>
+      </w:r>
+      <w:r>
+        <w:t>Monitors request performance and exports distributed trace spans.</w:t>
+      </w:r>
+    </w:p>
+    <w:p>
+      <w:pPr>
+        <w:pStyle w:val="ListBullet"/>
+        <w:spacing w:after="40"/>
+      </w:pPr>
+      <w:r>
+        <w:rPr>
+          <w:b/>
+        </w:rPr>
+        <w:t xml:space="preserve">Pub/Sub SSE Stream: </w:t>
+      </w:r>
+      <w:r>
+        <w:t>Pushes near real-time telemetry updates back to the Control Tower UI Layer.</w:t>
+      </w:r>
+    </w:p>
+    <w:p>
+      <w:pPr>
+        <w:spacing w:after="120"/>
       </w:pPr>
     </w:p>
     <w:p>
@@ -1437,7 +1263,7 @@
               <w:rPr>
                 <w:sz w:val="18"/>
               </w:rPr>
-              <w:t>Cloud KMS + Cloud DLP De-identification</w:t>
+              <w:t>Cloud KMS Key Destruction + Cloud DLP De-identification</w:t>
             </w:r>
           </w:p>
         </w:tc>
@@ -1624,7 +1450,7 @@
           <w:color w:val="1A73E8"/>
           <w:sz w:val="30"/>
         </w:rPr>
-        <w:t>5. System Modules &amp; Live Application Screenshots (http://localhost:8081/)</w:t>
+        <w:t>5. Live Application Console Screenshots (http://localhost:8081/)</w:t>
       </w:r>
     </w:p>
     <w:p>

</xml_diff>